<commit_message>
round 3... Claude ate an entire 5hr session limit in 20 minutes.  Codex added a bit.
</commit_message>
<xml_diff>
--- a/doc/FieldGuide/reference/book-reference.docx
+++ b/doc/FieldGuide/reference/book-reference.docx
@@ -1054,33 +1054,44 @@
       <w:color w:val="365F91" w:themeColor="accent1" w:themeShade="BF"/>
     </w:rPr>
   </w:style>
-  <w:style w:type="paragraph" w:customStyle="1" w:styleId="BookSubtitle">
-    <w:name w:val="Book Subtitle"/>
+  <w:style w:type="paragraph" w:customStyle="1" w:styleId="BookByline">
+    <w:name w:val="Book Byline"/>
     <w:basedOn w:val="Normal"/>
     <w:pPr>
       <w:jc w:val="center"/>
-      <w:spacing w:before="0" w:after="480"/>
-    </w:pPr>
-    <w:rPr>
-      <w:i/>
-      <w:color w:val="2D3B47"/>
-      <w:sz w:val="30"/>
-      <w:szCs w:val="30"/>
-    </w:rPr>
-  </w:style>
-  <w:style w:type="paragraph" w:styleId="Title">
-    <w:name w:val="Title"/>
-    <w:basedOn w:val="Normal"/>
-    <w:next w:val="BodyText"/>
-    <w:qFormat/>
-    <w:pPr>
       <w:spacing w:before="0" w:after="60"/>
     </w:pPr>
     <w:rPr>
+      <w:color w:val="5B6B7A"/>
+      <w:sz w:val="24"/>
+      <w:szCs w:val="24"/>
+    </w:rPr>
+  </w:style>
+  <w:style w:type="paragraph" w:customStyle="1" w:styleId="Date">
+    <w:name w:val="Date"/>
+    <w:basedOn w:val="Normal"/>
+    <w:next w:val="BodyText"/>
+    <w:qFormat/>
+    <w:pPr>
+      <w:pBdr>
+        <w:bottom w:val="single" w:sz="8" w:space="6" w:color="1F4E79"/>
+      </w:pBdr>
+      <w:spacing w:before="0" w:after="240"/>
+    </w:pPr>
+    <w:rPr>
       <w:b/>
-      <w:color w:val="1F4E79"/>
-      <w:sz w:val="48"/>
-      <w:szCs w:val="48"/>
+      <w:caps/>
+      <w:color w:val="5B6B7A"/>
+      <w:spacing w:val="10"/>
+      <w:sz w:val="18"/>
+      <w:szCs w:val="18"/>
+    </w:rPr>
+  </w:style>
+  <w:style w:type="character" w:customStyle="1" w:styleId="HeadingCode">
+    <w:name w:val="Heading Code"/>
+    <w:basedOn w:val="DefaultParagraphFont"/>
+    <w:rPr>
+      <w:rFonts w:ascii="Consolas" w:hAnsi="Consolas" w:cs="Consolas"/>
     </w:rPr>
   </w:style>
   <w:style w:type="paragraph" w:customStyle="1" w:styleId="SourceCode">
@@ -1100,6 +1111,35 @@
       <w:ind w:left="100" w:right="100"/>
     </w:pPr>
   </w:style>
+  <w:style w:type="paragraph" w:customStyle="1" w:styleId="BookSubtitle">
+    <w:name w:val="Book Subtitle"/>
+    <w:basedOn w:val="Normal"/>
+    <w:pPr>
+      <w:jc w:val="center"/>
+      <w:spacing w:before="0" w:after="480"/>
+    </w:pPr>
+    <w:rPr>
+      <w:i/>
+      <w:color w:val="2D3B47"/>
+      <w:sz w:val="30"/>
+      <w:szCs w:val="30"/>
+    </w:rPr>
+  </w:style>
+  <w:style w:type="paragraph" w:styleId="Title">
+    <w:name w:val="Title"/>
+    <w:basedOn w:val="Normal"/>
+    <w:next w:val="BodyText"/>
+    <w:qFormat/>
+    <w:pPr>
+      <w:spacing w:before="0" w:after="60"/>
+    </w:pPr>
+    <w:rPr>
+      <w:b/>
+      <w:color w:val="1F4E79"/>
+      <w:sz w:val="48"/>
+      <w:szCs w:val="48"/>
+    </w:rPr>
+  </w:style>
   <w:style w:type="paragraph" w:styleId="Subtitle">
     <w:name w:val="Subtitle"/>
     <w:basedOn w:val="Normal"/>
@@ -1113,65 +1153,6 @@
       <w:color w:val="2D3B47"/>
       <w:sz w:val="28"/>
       <w:szCs w:val="28"/>
-    </w:rPr>
-  </w:style>
-  <w:style w:type="paragraph" w:customStyle="1" w:styleId="BookByline">
-    <w:name w:val="Book Byline"/>
-    <w:basedOn w:val="Normal"/>
-    <w:pPr>
-      <w:jc w:val="center"/>
-      <w:spacing w:before="0" w:after="60"/>
-    </w:pPr>
-    <w:rPr>
-      <w:color w:val="5B6B7A"/>
-      <w:sz w:val="24"/>
-      <w:szCs w:val="24"/>
-    </w:rPr>
-  </w:style>
-  <w:style w:type="paragraph" w:customStyle="1" w:styleId="BookCover">
-    <w:name w:val="Book Cover"/>
-    <w:basedOn w:val="Normal"/>
-    <w:pPr>
-      <w:jc w:val="center"/>
-      <w:spacing w:before="720" w:after="360"/>
-    </w:pPr>
-  </w:style>
-  <w:style w:type="paragraph" w:customStyle="1" w:styleId="KeepWithNext">
-    <w:name w:val="Keep With Next"/>
-    <w:basedOn w:val="BodyText"/>
-    <w:pPr>
-      <w:keepNext/>
-    </w:pPr>
-  </w:style>
-  <w:style w:type="character" w:customStyle="1" w:styleId="VerbatimChar">
-    <w:name w:val="Verbatim Char"/>
-    <w:basedOn w:val="BodyTextChar"/>
-    <w:rPr>
-      <w:rFonts w:ascii="Consolas" w:hAnsi="Consolas" w:cs="Consolas"/>
-      <w:color w:val="1A4D80"/>
-      <w:sz w:val="19"/>
-      <w:szCs w:val="19"/>
-    </w:rPr>
-  </w:style>
-  <w:style w:type="paragraph" w:customStyle="1" w:styleId="BookTitle">
-    <w:name w:val="Book Title"/>
-    <w:basedOn w:val="Normal"/>
-    <w:pPr>
-      <w:jc w:val="center"/>
-      <w:spacing w:before="240" w:after="120"/>
-    </w:pPr>
-    <w:rPr>
-      <w:b/>
-      <w:color w:val="1F4E79"/>
-      <w:sz w:val="64"/>
-      <w:szCs w:val="64"/>
-    </w:rPr>
-  </w:style>
-  <w:style w:type="character" w:customStyle="1" w:styleId="HeadingCode">
-    <w:name w:val="Heading Code"/>
-    <w:basedOn w:val="DefaultParagraphFont"/>
-    <w:rPr>
-      <w:rFonts w:ascii="Consolas" w:hAnsi="Consolas" w:cs="Consolas"/>
     </w:rPr>
   </w:style>
   <w:style w:type="table" w:default="1" w:styleId="Table">
@@ -1208,24 +1189,43 @@
       </w:tcPr>
     </w:tblStylePr>
   </w:style>
-  <w:style w:type="paragraph" w:customStyle="1" w:styleId="Date">
-    <w:name w:val="Date"/>
-    <w:basedOn w:val="Normal"/>
-    <w:next w:val="BodyText"/>
-    <w:qFormat/>
-    <w:pPr>
-      <w:pBdr>
-        <w:bottom w:val="single" w:sz="8" w:space="6" w:color="1F4E79"/>
-      </w:pBdr>
-      <w:spacing w:before="0" w:after="240"/>
+  <w:style w:type="character" w:customStyle="1" w:styleId="VerbatimChar">
+    <w:name w:val="Verbatim Char"/>
+    <w:basedOn w:val="BodyTextChar"/>
+    <w:rPr>
+      <w:rFonts w:ascii="Consolas" w:hAnsi="Consolas" w:cs="Consolas"/>
+      <w:color w:val="1A4D80"/>
+      <w:sz w:val="19"/>
+      <w:szCs w:val="19"/>
+    </w:rPr>
+  </w:style>
+  <w:style w:type="paragraph" w:customStyle="1" w:styleId="KeepWithNext">
+    <w:name w:val="Keep With Next"/>
+    <w:basedOn w:val="BodyText"/>
+    <w:pPr>
+      <w:keepNext/>
+    </w:pPr>
+  </w:style>
+  <w:style w:type="paragraph" w:customStyle="1" w:styleId="BookCover">
+    <w:name w:val="Book Cover"/>
+    <w:basedOn w:val="Normal"/>
+    <w:pPr>
+      <w:jc w:val="center"/>
+      <w:spacing w:before="720" w:after="360"/>
+    </w:pPr>
+  </w:style>
+  <w:style w:type="paragraph" w:customStyle="1" w:styleId="BookTitle">
+    <w:name w:val="Book Title"/>
+    <w:basedOn w:val="Normal"/>
+    <w:pPr>
+      <w:jc w:val="center"/>
+      <w:spacing w:before="240" w:after="120"/>
     </w:pPr>
     <w:rPr>
       <w:b/>
-      <w:caps/>
-      <w:color w:val="5B6B7A"/>
-      <w:spacing w:val="10"/>
-      <w:sz w:val="18"/>
-      <w:szCs w:val="18"/>
+      <w:color w:val="1F4E79"/>
+      <w:sz w:val="64"/>
+      <w:szCs w:val="64"/>
     </w:rPr>
   </w:style>
 </w:styles>

</xml_diff>